<commit_message>
docs: Dokumentations-Audit-Korrekturen und fehlende CSV-Nachweise ergaenzen
- Dokumentation 00/01/02/04/06/07/08/09/10: fehlende Werte ergaenzt,
  veraltete/widerspruechliche Aussagen mit realen Primaernachweisen
  korrigiert (SecurityContext, PDB, NetworkPolicy, LimitRange,
  ResourceQuota, Promotion-/Rollback-Nachweis, finale Git-/Image-Staende)
- Fehlende bzw. fehlerhafte CSV-Dateien unter daten/ vervollstaendigt
  und gegen den echten Projektstand validiert
- networkpolicy_matrix.csv korrigiert: NetworkPolicies existieren auch
  in Dev, werden dort und in Prod mangels durchsetzendem CNI unter
  Docker Desktop jedoch nicht aktiv erzwungen
- Submodul-Zeiger pacman-gitops aktualisiert (verwaiste, nicht
  referenzierte LimitRange-/ResourceQuota-Patch-Dateien entfernt)
</commit_message>
<xml_diff>
--- a/dokumentation/00_projektuebersicht.docx
+++ b/dokumentation/00_projektuebersicht.docx
@@ -1151,6 +1151,53 @@
         </w:tc>
       </w:tr>
     </w:tbl>
+    <w:p/>
+    <w:p>
+      <w:pPr>
+        <w:pStyle w:val="Heading1"/>
+      </w:pPr>
+      <w:r>
+        <w:t>12. Offene Punkte</w:t>
+      </w:r>
+    </w:p>
+    <w:p>
+      <w:r>
+        <w:t xml:space="preserve">Die vollständige, laufend gepflegte Liste offener Punkte und technischer Schulden wird in textdateien/offene_punkte.txt geführt. Diese Projektübersicht fasst den Stand zum Zeitpunkt der letzten Konsolidierung zusammen und verschweigt keine offenen Punkte.</w:t>
+      </w:r>
+    </w:p>
+    <w:p>
+      <w:r>
+        <w:rPr>
+          <w:b/>
+        </w:rPr>
+        <w:t xml:space="preserve">Noch offen vor finaler Abgabe:</w:t>
+      </w:r>
+    </w:p>
+    <w:p>
+      <w:r>
+        <w:t xml:space="preserve">1. Finale Git-Commits beider Repositories und aktuell eingesetzte Image-Digests sind unmittelbar vor Abgabe erneut zu erfassen, da sich der Repository-Stand bis zur Abgabe ändern kann.</w:t>
+      </w:r>
+    </w:p>
+    <w:p>
+      <w:r>
+        <w:t xml:space="preserve">2. Ein vollständiger, mit Datenvergleich abgeschlossener Restore-Nachweis liegt für pacman-dev vor (Testfall IHK-RESTORE-UI-001); für pacman-prod wurde bisher nur der Backup-CronJob-Status, kein vollständiger Restore mit Datenvergleich durchgeführt.</w:t>
+      </w:r>
+    </w:p>
+    <w:p>
+      <w:r>
+        <w:t xml:space="preserve">3. Aktuelle Prometheus-Target- und Grafana-Dashboard-Primärnachweise stehen für den finalen Abgabestand noch aus.</w:t>
+      </w:r>
+    </w:p>
+    <w:p>
+      <w:r>
+        <w:t xml:space="preserve">4. Temporäre Diagnose-Pods, Port-Forwards, Test-Tokens und nicht benötigte lokale Images sind erst unmittelbar vor der Abgabe final zu bereinigen, nicht während der laufenden Weiterentwicklung.</w:t>
+      </w:r>
+    </w:p>
+    <w:p>
+      <w:r>
+        <w:t xml:space="preserve">Bekannte, bewusst dokumentierte Projektgrenzen (kein offener Fehler, sondern Rahmenbedingung): lokaler Single-Node-Cluster ohne echte Node-Hochverfügbarkeit, unter Docker Desktop nicht durchgehend erzwingbare NetworkPolicy-Durchsetzung, sowie fehlende eigene fachliche Pacman-Anwendungsmetriken (nur Plattform-/Kubernetes-Metriken vorhanden).</w:t>
+      </w:r>
+    </w:p>
     <w:sectPr>
       <w:footerReference w:type="default" r:id="rId9"/>
       <w:pgSz w:w="12240" w:h="15840"/>

</xml_diff>

<commit_message>
docs: Grafana-Primaernachweis ergaenzen und erledigte offene Punkte bereinigen
- Aktuellen Grafana-Dashboard-Screenshot (Dev/Prod) als Primaernachweis
  fuer den bisher fehlenden Prometheus-/Grafana-Nachweis hinzugefuegt
- textdateien/offene_punkte.txt um entsprechenden Nachtrag ergaenzt
- Offene-Punkte-Liste in 00_projektuebersicht.docx um den damit
  erledigten Punkt bereinigt
- Hinweis zu den bereits entfernten verwaisten LimitRange-/
  ResourceQuota-Patch-Dateien in 06_kubernetes_sicherheit_und_betrieb.docx
  auf erledigt aktualisiert
</commit_message>
<xml_diff>
--- a/dokumentation/00_projektuebersicht.docx
+++ b/dokumentation/00_projektuebersicht.docx
@@ -1185,12 +1185,7 @@
     </w:p>
     <w:p>
       <w:r>
-        <w:t xml:space="preserve">3. Aktuelle Prometheus-Target- und Grafana-Dashboard-Primärnachweise stehen für den finalen Abgabestand noch aus.</w:t>
-      </w:r>
-    </w:p>
-    <w:p>
-      <w:r>
-        <w:t xml:space="preserve">4. Temporäre Diagnose-Pods, Port-Forwards, Test-Tokens und nicht benötigte lokale Images sind erst unmittelbar vor der Abgabe final zu bereinigen, nicht während der laufenden Weiterentwicklung.</w:t>
+        <w:t xml:space="preserve">3. Temporäre Diagnose-Pods, Port-Forwards, Test-Tokens und nicht benötigte lokale Images sind erst unmittelbar vor der Abgabe final zu bereinigen, nicht während der laufenden Weiterentwicklung.</w:t>
       </w:r>
     </w:p>
     <w:p>

</xml_diff>

<commit_message>
docs: vollstaendigen Prod-Restore-Endnachweis ergaenzen und Offene-Punkte-Liste bereinigen
- Vollstaendigen End-to-End-Restore-Test (Testdatensatz anlegen, Backup,
  kontrollierte Loeschung, Restore mit Pruefsummenvalidierung,
  Anwendungs-Nachtest, Cleanup) fuer pacman-prod durchgefuehrt und in
  08_monitoring_backup_restore.docx (Abschnitt 11.2) sowie
  textdateien/offene_punkte.txt dokumentiert
- Damit entfaellt der bisher offene Punkt 'kein vollstaendiger
  Prod-Restore' in 00_projektuebersicht.docx
- Screenshot-Referenzen an die zwischenzeitlich umbenannten Dateien
  AP24-14/AP24-15 in screenshots/17_monitoring/ angepasst
</commit_message>
<xml_diff>
--- a/dokumentation/00_projektuebersicht.docx
+++ b/dokumentation/00_projektuebersicht.docx
@@ -1180,12 +1180,7 @@
     </w:p>
     <w:p>
       <w:r>
-        <w:t xml:space="preserve">2. Ein vollständiger, mit Datenvergleich abgeschlossener Restore-Nachweis liegt für pacman-dev vor (Testfall IHK-RESTORE-UI-001); für pacman-prod wurde bisher nur der Backup-CronJob-Status, kein vollständiger Restore mit Datenvergleich durchgeführt.</w:t>
-      </w:r>
-    </w:p>
-    <w:p>
-      <w:r>
-        <w:t xml:space="preserve">3. Temporäre Diagnose-Pods, Port-Forwards, Test-Tokens und nicht benötigte lokale Images sind erst unmittelbar vor der Abgabe final zu bereinigen, nicht während der laufenden Weiterentwicklung.</w:t>
+        <w:t xml:space="preserve">2. Temporäre Diagnose-Pods, Port-Forwards, Test-Tokens und nicht benötigte lokale Images sind erst unmittelbar vor der Abgabe final zu bereinigen, nicht während der laufenden Weiterentwicklung.</w:t>
       </w:r>
     </w:p>
     <w:p>

</xml_diff>

<commit_message>
docs: finalen Git-/Image-Nachweis erfassen und Abgabe-Bereinigung abschliessen
- Finale Git-Commits (pacman-app 608d061b, pacman-gitops fa4ec17d) und
  aktuell eingesetzte Dev-/Prod-Image-Digests unmittelbar vor Abgabe
  erneut erfasst; Argo CD bestaetigt beide Applications Synced/Healthy
- Finale Bereinigung durchgefuehrt: 4 temporaere kubectl-port-forward-
  Prozesse beendet, 2 manuelle Test-Jobs aus pacman-prod entfernt
  (Nachweis bereits vollstaendig gesichert), 1 nicht mehr benoetigtes
  lokales Docker-Image aus einer revertierten Aenderung geloescht
- 00_projektuebersicht.docx: beide verbleibenden Punkte der
  Offene-Punkte-Liste als abgeschlossen dokumentiert
- 10_uebergabe_und_betriebsanleitung.docx: pacman-gitops-HEAD auf den
  finalen Stand aktualisiert
- textdateien/offene_punkte.txt: entsprechenden Abschluss-Nachtrag
  ergaenzt
</commit_message>
<xml_diff>
--- a/dokumentation/00_projektuebersicht.docx
+++ b/dokumentation/00_projektuebersicht.docx
@@ -1170,17 +1170,7 @@
         <w:rPr>
           <w:b/>
         </w:rPr>
-        <w:t xml:space="preserve">Noch offen vor finaler Abgabe:</w:t>
-      </w:r>
-    </w:p>
-    <w:p>
-      <w:r>
-        <w:t xml:space="preserve">1. Finale Git-Commits beider Repositories und aktuell eingesetzte Image-Digests sind unmittelbar vor Abgabe erneut zu erfassen, da sich der Repository-Stand bis zur Abgabe ändern kann.</w:t>
-      </w:r>
-    </w:p>
-    <w:p>
-      <w:r>
-        <w:t xml:space="preserve">2. Temporäre Diagnose-Pods, Port-Forwards, Test-Tokens und nicht benötigte lokale Images sind erst unmittelbar vor der Abgabe final zu bereinigen, nicht während der laufenden Weiterentwicklung.</w:t>
+        <w:t xml:space="preserve">Finaler Abgabestand (23./24.09.2026): Die zuvor hier gelisteten Punkte (finale Git-Commits/Image-Digests, finale Bereinigung temporärer Diagnosemittel) sind abgeschlossen. pacman-app HEAD 608d061b02fbf01e916d05de19aa6ef27f2db71e, pacman-gitops HEAD fa4ec17d0c565034db5add11188ef1be4c8ebc12; Dev-Digest sha256:f3da04a5…, Prod-Digest sha256:8a30554b…; Argo CD pacman-dev und pacman-prod beide Synced/Healthy. Details siehe textdateien/offene_punkte.txt, Nachtrag „Finaler Git-/Image-Nachweis und Abgabe-Bereinigung“.</w:t>
       </w:r>
     </w:p>
     <w:p>

</xml_diff>